<commit_message>
Segarkan jurnal prompt, log mentah, dokumen Word, dan harness smoke UI
Jurnal memuat putaran audit 5 pilar, paginasi P-01, perombakan UI, dan papan desain;
log mentah dan ekspor Word ikut disegarkan; harness smoke slice 04-07 ditulis ulang
jadi mandiri plus dua harness baru (nav dan susun) dari papan desain.
</commit_message>
<xml_diff>
--- a/docs/word/jurnal-prompt.docx
+++ b/docs/word/jurnal-prompt.docx
@@ -916,6 +916,571 @@
     <w:p>
       <w:r>
         <w:t xml:space="preserve">  ekspor Word). Salinan byte-exact: `log-mentah/sesi-2026-10-05-chat-messages.json.gz`.</w:t>
+      </w:r>
+    </w:p>
+    <w:p>
+      <w:r/>
+    </w:p>
+    <w:p>
+      <w:pPr>
+        <w:pStyle w:val="ListBullet"/>
+      </w:pPr>
+      <w:r>
+        <w:t>**Putaran audit 5 pilar (9 Oktober 2026)**: permintaan pengguna — mengerjakan temuan `audit.md`</w:t>
+      </w:r>
+    </w:p>
+    <w:p>
+      <w:r>
+        <w:t xml:space="preserve">  menurut prioritas, satu per ID, dengan bukti angka. Yang selesai: kelompok 1 (otorisasi lintas</w:t>
+      </w:r>
+    </w:p>
+    <w:p>
+      <w:r>
+        <w:t xml:space="preserve">  guru + kunci jawaban/`Policy` di setiap endpoint) dan performa jalur pengerjaan (P-03 autosave</w:t>
+      </w:r>
+    </w:p>
+    <w:p>
+      <w:r>
+        <w:t xml:space="preserve">  bebas bank soal, P-04 pengumpulan satu `upsert` alih-alih query per soal), lalu **P-02 presence**:</w:t>
+      </w:r>
+    </w:p>
+    <w:p>
+      <w:r>
+        <w:t xml:space="preserve">  kehadiran dipindah dari satu peta utuh per kuis di cache ke **satu hash Redis per kuis + set</w:t>
+      </w:r>
+    </w:p>
+    <w:p>
+      <w:r>
+        <w:t xml:space="preserve">  indeks**, sehingga satu request murid hanya menyentuh satu medan (`HGET`/`HSET`, O(1)) dan dua</w:t>
+      </w:r>
+    </w:p>
+    <w:p>
+      <w:r>
+        <w:t xml:space="preserve">  request bersamaan tidak saling menimpa; guru tetap membaca satu kelas dengan satu `HGETALL`.</w:t>
+      </w:r>
+    </w:p>
+    <w:p>
+      <w:r>
+        <w:t xml:space="preserve">  Cadangan non-Redis (`GudangPeta`) dipertahankan, jalur gagal tetap *fail-open*, dan ada pemulihan</w:t>
+      </w:r>
+    </w:p>
+    <w:p>
+      <w:r>
+        <w:t xml:space="preserve">  kunci sisa bertipe string dari driver lama. Verifikasi: `./verify.sh` **HIJAU** — Pest **226 passed</w:t>
+      </w:r>
+    </w:p>
+    <w:p>
+      <w:r>
+        <w:t xml:space="preserve">  (1808 assertions)**, Pint 318 berkas, checkJs OK, ESLint 0 error, Vitest 42 berkas/338 test,</w:t>
+      </w:r>
+    </w:p>
+    <w:p>
+      <w:r>
+        <w:t xml:space="preserve">  realtime 15 test; smoke HTTP nyata dengan layanan lokal hidup (backend :8000, realtime :4000,</w:t>
+      </w:r>
+    </w:p>
+    <w:p>
+      <w:r>
+        <w:t xml:space="preserve">  frontend :5173) **242/242 lulus**; jumlah perintah Redis diukur sungguhan lewat `INFO commandstats`</w:t>
+      </w:r>
+    </w:p>
+    <w:p>
+      <w:r>
+        <w:t xml:space="preserve">  (satu request murid = 1 hget + 1 hset, tanpa `HGETALL`). Batasan jujur ada di</w:t>
+      </w:r>
+    </w:p>
+    <w:p>
+      <w:r>
+        <w:t xml:space="preserve">  `laporan-pengujian.md` A.22.6 (P-01 paginasi masih terbuka, belum ada uji beban lapangan).</w:t>
+      </w:r>
+    </w:p>
+    <w:p>
+      <w:r/>
+    </w:p>
+    <w:p>
+      <w:pPr>
+        <w:pStyle w:val="ListBullet"/>
+      </w:pPr>
+      <w:r>
+        <w:t>**Putaran P-01 paginasi (9 Oktober 2026)**: lanjutan prioritas `audit.md` — satu-satunya temuan</w:t>
+      </w:r>
+    </w:p>
+    <w:p>
+      <w:r>
+        <w:t xml:space="preserve">  kelompok 2 yang masih terbuka sesudah P-02/P-03/P-04. Endpoint yang paling tidak terbatas</w:t>
+      </w:r>
+    </w:p>
+    <w:p>
+      <w:r>
+        <w:t xml:space="preserve">  (**daftar murid**) dijadikan contoh pertama: `MuridController::index` sekarang `-&gt;paginate`</w:t>
+      </w:r>
+    </w:p>
+    <w:p>
+      <w:r>
+        <w:t xml:space="preserve">  (**50/halaman**, batas atas 200) dengan bentuk respons paginator Laravel (`data[]` + `meta`),</w:t>
+      </w:r>
+    </w:p>
+    <w:p>
+      <w:r>
+        <w:t xml:space="preserve">  frontend `HalamanMurid` mendapat tombol Sebelumnya/Berikutnya + "Menampilkan N dari M murid",</w:t>
+      </w:r>
+    </w:p>
+    <w:p>
+      <w:r>
+        <w:t xml:space="preserve">  dan `skemaHalamanMurid` menolak bentuk array lama. Verifikasi: `php artisan test` **227 passed</w:t>
+      </w:r>
+    </w:p>
+    <w:p>
+      <w:r>
+        <w:t xml:space="preserve">  (1818 assertions)**, `./verify.sh` **HIJAU** (Vitest kini 43 berkas/342 test), smoke HTTP nyata</w:t>
+      </w:r>
+    </w:p>
+    <w:p>
+      <w:r>
+        <w:t xml:space="preserve">  **242/242 lulus**. Batasan jujur: P-01 baru sebagian — kuis, materi, koreksi, peringkat, ekspor</w:t>
+      </w:r>
+    </w:p>
+    <w:p>
+      <w:r>
+        <w:t xml:space="preserve">  nilai, monitor, dan kecurangan masih memuat semua baris (lihat `laporan-pengujian.md` A.23.6).</w:t>
+      </w:r>
+    </w:p>
+    <w:p>
+      <w:r/>
+    </w:p>
+    <w:p>
+      <w:pPr>
+        <w:pStyle w:val="ListBullet"/>
+      </w:pPr>
+      <w:r>
+        <w:t>**Putaran UI (10 Oktober 2026)**: permintaan pengguna — tombol Ubah di `/kuis` belum responsif,</w:t>
+      </w:r>
+    </w:p>
+    <w:p>
+      <w:r>
+        <w:t xml:space="preserve">  layout kurang rapih, minta **hamburger** untuk tiap bagian, utamakan **ikon**, dan matangkan</w:t>
+      </w:r>
+    </w:p>
+    <w:p>
+      <w:r>
+        <w:t xml:space="preserve">  **editor materi** ("saat di play video gak jalan" → pakai media native HTML + sinkron). Yang</w:t>
+      </w:r>
+    </w:p>
+    <w:p>
+      <w:r>
+        <w:t xml:space="preserve">  dikerjakan: shell baru (navbar pil ber-ikon ≥ lg, laci hamburger &lt; lg, tutup lewat Escape/overlay/</w:t>
+      </w:r>
+    </w:p>
+    <w:p>
+      <w:r>
+        <w:t xml:space="preserve">  tautan), baris aksi kartu kuis ber-ikon yang membungkus rapi, dan pratinjau editor materi memakai</w:t>
+      </w:r>
+    </w:p>
+    <w:p>
+      <w:r>
+        <w:t xml:space="preserve">  `&lt;video&gt;`/`&lt;audio&gt;` native yang mengikuti jam timeline (`offsetMedia`), plus perbaikan klip</w:t>
+      </w:r>
+    </w:p>
+    <w:p>
+      <w:r>
+        <w:t xml:space="preserve">  berdurasi 0 supaya media tetap muncul. Verifikasi: `./verify.sh` **HIJAU** (Pest 227 passed/1818</w:t>
+      </w:r>
+    </w:p>
+    <w:p>
+      <w:r>
+        <w:t xml:space="preserve">  assertions, Vitest 44 berkas/355 test), `npm run build` lolos, smoke CDP baru</w:t>
+      </w:r>
+    </w:p>
+    <w:p>
+      <w:r>
+        <w:t xml:space="preserve">  `docs/smoke-ui-nav.mjs` **13/13** (390 px &amp; 1280 px), dan cek editor via CDP **7/7** (media benar</w:t>
+      </w:r>
+    </w:p>
+    <w:p>
+      <w:r>
+        <w:t xml:space="preserve">  berjalan saat timeline diputar). Batasan: perombakan seluruh halaman belum, lihat A.24.6.</w:t>
+      </w:r>
+    </w:p>
+    <w:p>
+      <w:r/>
+    </w:p>
+    <w:p>
+      <w:pPr>
+        <w:pStyle w:val="ListBullet"/>
+      </w:pPr>
+      <w:r>
+        <w:t>**Putaran desain Ulangan Sekolah (10 Oktober 2026)**: pengguna menyerahkan paket desain</w:t>
+      </w:r>
+    </w:p>
+    <w:p>
+      <w:r>
+        <w:t xml:space="preserve">  `desain-ulangan-sekolah.zip` (12 papan: audit + contoh "sesudah" + papan Standar) dan meminta</w:t>
+      </w:r>
+    </w:p>
+    <w:p>
+      <w:r>
+        <w:t xml:space="preserve">  melanjutkan UI dengan acuan itu; lewat pilihan, pengguna memutuskan **palet diselaraskan ke palet</w:t>
+      </w:r>
+    </w:p>
+    <w:p>
+      <w:r>
+        <w:t xml:space="preserve">  resmi spesifikasi** dan pekerjaan mengikuti urutan papan mulai dari fondasi. Yang dikerjakan:</w:t>
+      </w:r>
+    </w:p>
+    <w:p>
+      <w:r>
+        <w:t xml:space="preserve">  token baru (cincin fokus yang lolos kontras, skala jarak &amp; huruf), `Tombol` varian bahaya + ukuran</w:t>
+      </w:r>
+    </w:p>
+    <w:p>
+      <w:r>
+        <w:t xml:space="preserve">  44 px + `TombolIkon` ber-`aria-label`, komponen `DialogKonfirmasi` (menggantikan 6 dari 7</w:t>
+      </w:r>
+    </w:p>
+    <w:p>
+      <w:r>
+        <w:t xml:space="preserve">  `window.confirm`), `Skeleton`, `KosongData`, `HeaderHalaman`, `TabelData` (tabel → kartu di HP),</w:t>
+      </w:r>
+    </w:p>
+    <w:p>
+      <w:r>
+        <w:t xml:space="preserve">  `PanelForm` (dialog samping), dan `KerangkaUmum` menjadi panel samping indigo berkelompok</w:t>
+      </w:r>
+    </w:p>
+    <w:p>
+      <w:r>
+        <w:t xml:space="preserve">  (Ringkasan/Ujian/Data induk/Belajar) dengan menu Beranda serta ikon Kuis berbeda dari Bank Soal.</w:t>
+      </w:r>
+    </w:p>
+    <w:p>
+      <w:r>
+        <w:t xml:space="preserve">  Papan 3 "Kelola Kelas (sesudah)" diterapkan penuh, lalu polanya dipakai di Mapel, Murid, Tag,</w:t>
+      </w:r>
+    </w:p>
+    <w:p>
+      <w:r>
+        <w:t xml:space="preserve">  Bank Soal, dan Kuis. Verifikasi: `./verify.sh` **SEMUA HIJAU exit 0** — Pest **227 passed</w:t>
+      </w:r>
+    </w:p>
+    <w:p>
+      <w:r>
+        <w:t xml:space="preserve">  (1818 assertions)**, Pint 318 berkas, checkJs OK, ESLint 0 error, Vitest **46 berkas/373 test**</w:t>
+      </w:r>
+    </w:p>
+    <w:p>
+      <w:r>
+        <w:t xml:space="preserve">  (naik dari 44/355), realtime 15 test. Batasan jujur ada di `laporan-pengujian.md` A.25.6 — layar</w:t>
+      </w:r>
+    </w:p>
+    <w:p>
+      <w:r>
+        <w:t xml:space="preserve">  ulangan (papan 4/5), beranda (2), dan papan 7–12 belum dikerjakan.</w:t>
+      </w:r>
+    </w:p>
+    <w:p>
+      <w:r/>
+    </w:p>
+    <w:p>
+      <w:pPr>
+        <w:pStyle w:val="ListBullet"/>
+      </w:pPr>
+      <w:r>
+        <w:t>**Putaran desain lanjutan — layar ulangan &amp; beranda (10 Oktober 2026)**: melanjutkan urutan papan</w:t>
+      </w:r>
+    </w:p>
+    <w:p>
+      <w:r>
+        <w:t xml:space="preserve">  desain ke papan 4/5 dan 2. Layar ulangan murid sekarang punya **kepala lengket** (judul, lencana</w:t>
+      </w:r>
+    </w:p>
+    <w:p>
+      <w:r>
+        <w:t xml:space="preserve">  pengaman, progress bar terjawab, sisa waktu, tombol Selesai), **satu soal per layar**, **navigator</w:t>
+      </w:r>
+    </w:p>
+    <w:p>
+      <w:r>
+        <w:t xml:space="preserve">  nomor** empat keadaan (dijawab / ragu-ragu / belum dijawab / aktif) yang dilipat di HP, **penanda</w:t>
+      </w:r>
+    </w:p>
+    <w:p>
+      <w:r>
+        <w:t xml:space="preserve">  ragu**, banner **koneksi putus**, dan **dialog ringkasan sebelum mengumpulkan** — ini menggantikan</w:t>
+      </w:r>
+    </w:p>
+    <w:p>
+      <w:r>
+        <w:t xml:space="preserve">  `window.confirm` terakhir, jadi tidak ada lagi `window.confirm` di seluruh `src/`. Skala huruf murid</w:t>
+      </w:r>
+    </w:p>
+    <w:p>
+      <w:r>
+        <w:t xml:space="preserve">  dibesarkan (teks soal 26 px, pilihan 20 px/68 px). Beranda guru menjadi **dasbor berbasis tugas**:</w:t>
+      </w:r>
+    </w:p>
+    <w:p>
+      <w:r>
+        <w:t xml:space="preserve">  "Perlu perhatian" (berlangsung → Buka monitor, antrean koreksi, laporan avatar), 4 angka ringkas, dan</w:t>
+      </w:r>
+    </w:p>
+    <w:p>
+      <w:r>
+        <w:t xml:space="preserve">  jadwal kuis bertab Hari ini / Minggu ini; beranda murid menampilkan ulangan berikutnya + pintasan.</w:t>
+      </w:r>
+    </w:p>
+    <w:p>
+      <w:r>
+        <w:t xml:space="preserve">  Verifikasi: `./verify.sh` **SEMUA HIJAU exit 0** — Pest **227 passed (1818 assertions)**, Pint 318</w:t>
+      </w:r>
+    </w:p>
+    <w:p>
+      <w:r>
+        <w:t xml:space="preserve">  berkas, checkJs OK, ESLint 0 error, Vitest **49 berkas/397 test** (A.25: 46/373), realtime 15 test,</w:t>
+      </w:r>
+    </w:p>
+    <w:p>
+      <w:r>
+        <w:t xml:space="preserve">  `npm run build` lolos. Batasan jujur di `laporan-pengujian.md` A.26.6 — papan 7–12 (Monitor, Koreksi,</w:t>
+      </w:r>
+    </w:p>
+    <w:p>
+      <w:r>
+        <w:t xml:space="preserve">  Progres, Kuis 3 langkah, EditorSoal, EditorMateri) belum dikerjakan.</w:t>
+      </w:r>
+    </w:p>
+    <w:p>
+      <w:r/>
+    </w:p>
+    <w:p>
+      <w:pPr>
+        <w:pStyle w:val="ListBullet"/>
+      </w:pPr>
+      <w:r>
+        <w:t>**Putaran desain lanjutan — Monitor, Koreksi, Progres (10 Oktober 2026)**: menutup urutan papan 7–9.</w:t>
+      </w:r>
+    </w:p>
+    <w:p>
+      <w:r>
+        <w:t xml:space="preserve">  Live Monitor memakai kepala halaman bersama, **strip angka ringkas dari snapshot server**</w:t>
+      </w:r>
+    </w:p>
+    <w:p>
+      <w:r>
+        <w:t xml:space="preserve">  (Mengerjakan / Selesai / Tidak aktif / Perlu ditinjau), tabel murid via `TabelData` (jadi kartu di HP,</w:t>
+      </w:r>
+    </w:p>
+    <w:p>
+      <w:r>
+        <w:t xml:space="preserve">  kolom Catatan tidak lagi terdorong keluar layar), kolom **Terakhir aktif** dalam bahasa manusia, pil</w:t>
+      </w:r>
+    </w:p>
+    <w:p>
+      <w:r>
+        <w:t xml:space="preserve">  saringan catatan, dan keadaan kosong per saringan. Koreksi manual dan Progres Tema mendapat kepala</w:t>
+      </w:r>
+    </w:p>
+    <w:p>
+      <w:r>
+        <w:t xml:space="preserve">  bersama, skeleton, kosong-data, ukuran tombol 44 px, dan Progres Tema mendapat **saringan "Semua tema /</w:t>
+      </w:r>
+    </w:p>
+    <w:p>
+      <w:r>
+        <w:t xml:space="preserve">  Perlu dilatih"**. Verifikasi: `./verify.sh` **SEMUA HIJAU exit 0** — Pest **227 passed (1818</w:t>
+      </w:r>
+    </w:p>
+    <w:p>
+      <w:r>
+        <w:t xml:space="preserve">  assertions)**, Pint 318 berkas, checkJs OK, ESLint 0 error, Vitest **50 berkas/401 test** (A.26:</w:t>
+      </w:r>
+    </w:p>
+    <w:p>
+      <w:r>
+        <w:t xml:space="preserve">  49/397), realtime 15 test, `npm run build` lolos. Batasan di A.27.6: papan 10–12 (Kuis 3 langkah,</w:t>
+      </w:r>
+    </w:p>
+    <w:p>
+      <w:r>
+        <w:t xml:space="preserve">  EditorSoal, EditorMateri) belum, papan 8 baru sebagian, 3 halaman masih `table-responsive`.</w:t>
+      </w:r>
+    </w:p>
+    <w:p>
+      <w:pPr>
+        <w:pStyle w:val="ListBullet"/>
+      </w:pPr>
+      <w:r>
+        <w:t>**Putaran desain lanjutan — papan 10 &amp; 11 + satu sistem tombol (10 Oktober 2026)**: menutup dua papan</w:t>
+      </w:r>
+    </w:p>
+    <w:p>
+      <w:r>
+        <w:t xml:space="preserve">  terakhir paket desain. **Papan 10**: halaman kuis guru jadi alur **tiga langkah** (info &amp; jadwal → susun</w:t>
+      </w:r>
+    </w:p>
+    <w:p>
+      <w:r>
+        <w:t xml:space="preserve">  soal → tinjau &amp; publikasi) dengan pil langkah bernomor (`LangkahPil`, `aria-current="step"`), bank soal</w:t>
+      </w:r>
+    </w:p>
+    <w:p>
+      <w:r>
+        <w:t xml:space="preserve">  sebagai baris centang ber-label, panel susunan bernomor dengan tombol naik/turun ber-`aria-label`, dan</w:t>
+      </w:r>
+    </w:p>
+    <w:p>
+      <w:r>
+        <w:t xml:space="preserve">  langkah 3 berisi daftar kelengkapan + ringkasan (tombol terbit mati selama ada butir "Belum").</w:t>
+      </w:r>
+    </w:p>
+    <w:p>
+      <w:r>
+        <w:t xml:space="preserve">  **Papan 11**: editor soal jadi tiga kartu bernomor + sisi kanan lengket berisi pratinjau (`RendererSoal`</w:t>
+      </w:r>
+    </w:p>
+    <w:p>
+      <w:r>
+        <w:t xml:space="preserve">  yang sama dengan layar murid) dan daftar **Kelengkapan** yang diturunkan dari validator yang sama</w:t>
+      </w:r>
+    </w:p>
+    <w:p>
+      <w:r>
+        <w:t xml:space="preserve">  (`kelengkapanSoal()`), jadi daftar periksa tidak pernah berbeda pendapat dengan galat simpan; kunci</w:t>
+      </w:r>
+    </w:p>
+    <w:p>
+      <w:r>
+        <w:t xml:space="preserve">  benar/salah dan pemilih tipe memakai pil (bukan `&lt;select&gt;`). **Butir DoD "satu sistem tombol"**: seluruh</w:t>
+      </w:r>
+    </w:p>
+    <w:p>
+      <w:r>
+        <w:t xml:space="preserve">  kelas tombol Bootstrap di JSX (`btn-sm`, `btn-outline-*`, `btn-primary`) diganti `Tombol`/`TombolTaut`/</w:t>
+      </w:r>
+    </w:p>
+    <w:p>
+      <w:r>
+        <w:t xml:space="preserve">  `TombolIkon`, pemetaannya di `theme.css` dihapus, dan dijaga tes baru `sistemTombol.test.js`.</w:t>
+      </w:r>
+    </w:p>
+    <w:p>
+      <w:r>
+        <w:t xml:space="preserve">  Verifikasi: `./verify.sh` **SEMUA HIJAU exit 0** — Pest **227 passed (1818 assertions)**, Pint OK,</w:t>
+      </w:r>
+    </w:p>
+    <w:p>
+      <w:r>
+        <w:t xml:space="preserve">  checkJs OK, ESLint 0 error, Vitest **53 berkas/428 test** (A.27: 50/401), realtime 15 test,</w:t>
+      </w:r>
+    </w:p>
+    <w:p>
+      <w:r>
+        <w:t xml:space="preserve">  `npm run build` lolos, smoke CDP baru `docs/smoke-ui-susun.mjs` **40/40**; `smoke-ui-nav.mjs` 14/14 dan</w:t>
+      </w:r>
+    </w:p>
+    <w:p>
+      <w:r>
+        <w:t xml:space="preserve">  `smoke-ui-slice03.mjs` 9/9 setelah disesuaikan. Batasan di A.28.7: papan 8 baru sebagian, smoke</w:t>
+      </w:r>
+    </w:p>
+    <w:p>
+      <w:r>
+        <w:t xml:space="preserve">  slice 04–07 belum dibereskan.</w:t>
+      </w:r>
+    </w:p>
+    <w:p>
+      <w:r/>
+    </w:p>
+    <w:p>
+      <w:pPr>
+        <w:pStyle w:val="ListBullet"/>
+      </w:pPr>
+      <w:r>
+        <w:t>**Putaran verifikasi — smoke mandiri slice 04–07 dan bug payload soal letak kata (10 Oktober 2026)**:</w:t>
+      </w:r>
+    </w:p>
+    <w:p>
+      <w:r>
+        <w:t xml:space="preserve">  menutup utang A.28.7. Semua harness slice 04–07 ditulis ulang jadi **mandiri** (membuat soal + ulangan</w:t>
+      </w:r>
+    </w:p>
+    <w:p>
+      <w:r>
+        <w:t xml:space="preserve">  untuk kelas murid uji, memeriksa lewat layar sungguhan, lalu menghapus jejaknya di blok `finally` dan</w:t>
+      </w:r>
+    </w:p>
+    <w:p>
+      <w:r>
+        <w:t xml:space="preserve">  memulihkan pengaturan yang diubah), plus tahan **429** (throttle masuk 5/menit), menutup tab Chrome</w:t>
+      </w:r>
+    </w:p>
+    <w:p>
+      <w:r>
+        <w:t xml:space="preserve">  sendiri, dan mengikuti teks UI baru (satu soal per layar, "x dari N terjawab", "Selesai" →</w:t>
+      </w:r>
+    </w:p>
+    <w:p>
+      <w:r>
+        <w:t xml:space="preserve">  "Kumpulkan", panel "Catatan untuk ditinjau"). Harness baru itu **menemukan bug nyata (Q-19)**:</w:t>
+      </w:r>
+    </w:p>
+    <w:p>
+      <w:r>
+        <w:t xml:space="preserve">  `AttemptService::payloadSoal()` hanya menyalin `opsi/kiri/kanan/item`, sehingga soal **letak kata**</w:t>
+      </w:r>
+    </w:p>
+    <w:p>
+      <w:r>
+        <w:t xml:space="preserve">  sampai ke perangkat murid **tanpa `kata` dan `posisi`** — soal tampil kosong dan mustahil dijawab dari</w:t>
+      </w:r>
+    </w:p>
+    <w:p>
+      <w:r>
+        <w:t xml:space="preserve">  layar, sementara penilaian lewat API tetap "benar" sehingga tidak tertangkap uji lama. Perbaikan:</w:t>
+      </w:r>
+    </w:p>
+    <w:p>
+      <w:r>
+        <w:t xml:space="preserve">  daftar putih ditambah `kata` + `posisi`; penjaganya tes baru di `Slice06Test` yang sudah dibuktikan</w:t>
+      </w:r>
+    </w:p>
+    <w:p>
+      <w:r>
+        <w:t xml:space="preserve">  gagal bila perbaikan dibalik. Satu salah tulis seeder (`UserStatus` → `Usa_erStatus`, 213 tes gagal)</w:t>
+      </w:r>
+    </w:p>
+    <w:p>
+      <w:r>
+        <w:t xml:space="preserve">  juga tertangkap `verify.sh` dan dipulihkan. Verifikasi: `./verify.sh` **SEMUA HIJAU exit 0** — Pest</w:t>
+      </w:r>
+    </w:p>
+    <w:p>
+      <w:r>
+        <w:t xml:space="preserve">  **228 passed (1833 assertions)**, Pint OK, checkJs OK, ESLint 0 error, Vitest 53 berkas/428 test,</w:t>
+      </w:r>
+    </w:p>
+    <w:p>
+      <w:r>
+        <w:t xml:space="preserve">  realtime 15 test; seluruh smoke UI satu tarikan **148 pemeriksaan lulus** (nav 14/14 · susun 40/40 ·</w:t>
+      </w:r>
+    </w:p>
+    <w:p>
+      <w:r>
+        <w:t xml:space="preserve">  slice03 9/9 · slice04 18/18 · slice05 20/20 · slice06 27/27 · slice07 20/20), `smoke-http-fitur.mjs`</w:t>
+      </w:r>
+    </w:p>
+    <w:p>
+      <w:r>
+        <w:t xml:space="preserve">  **242/242**, dan slice04/slice05 diulang berturut-turut tetap penuh (harness mandiri memang bisa</w:t>
+      </w:r>
+    </w:p>
+    <w:p>
+      <w:r>
+        <w:t xml:space="preserve">  dijalankan berulang). Batasan di A.29.7: papan 8 (Koreksi) masih sebagian, tanpa uji visual, smoke UI</w:t>
+      </w:r>
+    </w:p>
+    <w:p>
+      <w:r>
+        <w:t xml:space="preserve">  butuh empat layanan hidup.</w:t>
       </w:r>
     </w:p>
     <w:sectPr>

</xml_diff>

<commit_message>
Buktikan pemutar materi di layar sungguhan lalu rapikan penunjuk langkah koreksi
Pemutar kuis-sisipan sebelumnya hanya diuji Pest/Vitest, jadi celah bukti terbesarnya
ditutup dengan harness smoke mandiri baru (membuat lalu menghapus materi ujinya sendiri)
plus runner satu perintah yang menyalakan backend+vite+Chrome dan mematikannya lagi —
22/22 lulus, dari menyusun rasio 9:16 sampai panel kuis muncul sendiri saat video
mencapai detiknya. Putaran yang sama juga menyelesaikan bagian papan 8 yang bisa
dikerjakan tanpa mengubah makna token konfirmasi: penunjuk langkah "skor & alasan →
token → tersimpan" dengan nomor langkah yang dihitung pembantu murni, sisa tombol
Bootstrap di form koreksi dibersihkan, dan alur koreksi di layar diulang lewat runner
baru (slice 06 27/27). Dokumentasi A.31/A.32, batasan penjelasan-fitur, dan tiga
dokumen Word yang sumbernya berubah ikut disegarkan.

🤖 Generated with Codebuff
Co-Authored-By: Codebuff <noreply@codebuff.com>
</commit_message>
<xml_diff>
--- a/docs/word/jurnal-prompt.docx
+++ b/docs/word/jurnal-prompt.docx
@@ -1481,6 +1481,254 @@
     <w:p>
       <w:r>
         <w:t xml:space="preserve">  butuh empat layanan hidup.</w:t>
+      </w:r>
+    </w:p>
+    <w:p>
+      <w:r/>
+    </w:p>
+    <w:p>
+      <w:pPr>
+        <w:pStyle w:val="ListBullet"/>
+      </w:pPr>
+      <w:r>
+        <w:t>**Putaran 22 tipe soal — objektif 1 tuntas + objektif 2A (10 Oktober 2026)**: prompt eksternal di luar</w:t>
+      </w:r>
+    </w:p>
+    <w:p>
+      <w:r>
+        <w:t xml:space="preserve">  repo meminta dua objektif — menambah tipe soal dari 8 menjadi **22** beserta penilaian parsial, dan</w:t>
+      </w:r>
+    </w:p>
+    <w:p>
+      <w:r>
+        <w:t xml:space="preserve">  deteksi extension. Objektif 1 dikerjakan tiga gelombang sampai tuntas (kontrak `bobot()` 0.0–1.0,</w:t>
+      </w:r>
+    </w:p>
+    <w:p>
+      <w:r>
+        <w:t xml:space="preserve">  delapan tipe lama tetap biner lewat trait `BobotBiner`, empat belas tipe baru, payload murid dijaga</w:t>
+      </w:r>
+    </w:p>
+    <w:p>
+      <w:r>
+        <w:t xml:space="preserve">  tidak pernah memuat kunci), sedangkan objektif 2 baru sebagian (**2A**: `tamper_suspected` pindah ke</w:t>
+      </w:r>
+    </w:p>
+    <w:p>
+      <w:r>
+        <w:t xml:space="preserve">  kelompok turunan server supaya murid tidak bisa menulis "dugaan gangguan proteksi", klien hanya boleh</w:t>
+      </w:r>
+    </w:p>
+    <w:p>
+      <w:r>
+        <w:t xml:space="preserve">  `dom_injection` + `extension_detected`). Dua bug nyata tertangkap tes baru: kotak klasifikasi tersimpan</w:t>
+      </w:r>
+    </w:p>
+    <w:p>
+      <w:r>
+        <w:t xml:space="preserve">  tanpa label, dan daftar jawaban diterima tidak muncul di pratinjau guru. Verifikasi: `./verify.sh`</w:t>
+      </w:r>
+    </w:p>
+    <w:p>
+      <w:r>
+        <w:t xml:space="preserve">  **SEMUA HIJAU**, Pest **253 passed (2256 assertions)**, Vitest **54 berkas/484 test**, `Slice07Test`</w:t>
+      </w:r>
+    </w:p>
+    <w:p>
+      <w:r>
+        <w:t xml:space="preserve">  16 passed. Rincian di `laporan-pengujian.md` A.30.</w:t>
+      </w:r>
+    </w:p>
+    <w:p>
+      <w:r/>
+    </w:p>
+    <w:p>
+      <w:pPr>
+        <w:pStyle w:val="ListBullet"/>
+      </w:pPr>
+      <w:r>
+        <w:t>**Putaran editor materi gaya video editor + kuis sisipan di dalam klip (10 Oktober 2026)**: pengguna</w:t>
+      </w:r>
+    </w:p>
+    <w:p>
+      <w:r>
+        <w:t xml:space="preserve">  menyerahkan paket perubahan eksternal `files (67).zip` (dua patch + 17 berkas utuh) dengan izin</w:t>
+      </w:r>
+    </w:p>
+    <w:p>
+      <w:r>
+        <w:t xml:space="preserve">  "boleh langsung apply atau boleh modif". Kedua patch **apply bersih**, lalu hasilnya dicocokkan dengan</w:t>
+      </w:r>
+    </w:p>
+    <w:p>
+      <w:r>
+        <w:t xml:space="preserve">  `file-berubah.zip` lewat `diff -rq`: identik kecuali `theme.css` yang basisnya 438 baris lebih tua</w:t>
+      </w:r>
+    </w:p>
+    <w:p>
+      <w:r>
+        <w:t xml:space="preserve">  (patch melaporkan offset 438 di kelima hunk-nya). Isi fitur: rasio bingkai materi</w:t>
+      </w:r>
+    </w:p>
+    <w:p>
+      <w:r>
+        <w:t xml:space="preserve">  (16:9/9:16/1:1/4:3), timeline klip dengan pengaturan tampilan per klip (media utuh/penuhi bingkai +</w:t>
+      </w:r>
+    </w:p>
+    <w:p>
+      <w:r>
+        <w:t xml:space="preserve">  titik fokus + zoom; kuis video jeda/berjalan + tata panel), urutan bagian murid mengikuti **timeline**,</w:t>
+      </w:r>
+    </w:p>
+    <w:p>
+      <w:r>
+        <w:t xml:space="preserve">  dan pemutar murid yang memunculkan kuis tepat pada detiknya sementara server menahan penutupan video</w:t>
+      </w:r>
+    </w:p>
+    <w:p>
+      <w:r>
+        <w:t xml:space="preserve">  sampai kuis wajib di dalamnya selesai. Patch itu **apa adanya tidak lolos pagar mutu repo**, jadi yang</w:t>
+      </w:r>
+    </w:p>
+    <w:p>
+      <w:r>
+        <w:t xml:space="preserve">  saya perbaiki adalah penyebabnya: `z.record()` satu-argumen (di Zod 4 argumen itu dibaca sebagai tipe</w:t>
+      </w:r>
+    </w:p>
+    <w:p>
+      <w:r>
+        <w:t xml:space="preserve">  kunci, sehingga nilai `tampilan` tidak tervalidasi sama sekali) ditulis dua-argumen sesuai konvensi</w:t>
+      </w:r>
+    </w:p>
+    <w:p>
+      <w:r>
+        <w:t xml:space="preserve">  berkas lain, custom property `--r` diberi cast `CSSProperties`, param `gayaMedia` dilonggarkan ke bentuk</w:t>
+      </w:r>
+    </w:p>
+    <w:p>
+      <w:r>
+        <w:t xml:space="preserve">  yang benar-benar dipakainya, ref yang dibaca saat render diganti state, dan efek `setState` sinkron</w:t>
+      </w:r>
+    </w:p>
+    <w:p>
+      <w:r>
+        <w:t xml:space="preserve">  diganti `key={blokAktif.block_id}`. Verifikasi: `./verify.sh` **SEMUA HIJAU exit 0** — Pest **256 passed</w:t>
+      </w:r>
+    </w:p>
+    <w:p>
+      <w:r>
+        <w:t xml:space="preserve">  (2304 assertions)**, Pint 335 berkas, checkJs OK, ESLint 0 error, Vitest **56 berkas/505 test**,</w:t>
+      </w:r>
+    </w:p>
+    <w:p>
+      <w:r>
+        <w:t xml:space="preserve">  realtime 15 test; `Slice08Test` 12 passed (172 assertions). Di-commit sebagai `a859f78`.</w:t>
+      </w:r>
+    </w:p>
+    <w:p>
+      <w:r>
+        <w:t xml:space="preserve">  **Bukti layar sungguhan menyusul di putaran yang sama**: harness baru `docs/smoke-ui-materi.mjs`</w:t>
+      </w:r>
+    </w:p>
+    <w:p>
+      <w:r>
+        <w:t xml:space="preserve">  (dijalankan lewat `docs/jalankan-smoke-materi.sh`, backend+vite+Chrome sendiri, **tanpa** unggah berkas)</w:t>
+      </w:r>
+    </w:p>
+    <w:p>
+      <w:r>
+        <w:t xml:space="preserve">  lulus **22/22** — guru menyusun materi ber-rasio 9:16 dengan kuis sisipan di detik 20, murid membuka</w:t>
+      </w:r>
+    </w:p>
+    <w:p>
+      <w:r>
+        <w:t xml:space="preserve">  materinya, urutan bagian mengikuti timeline, bingkai `--r = 0.5625`, gaya media `object-fit: cover` +</w:t>
+      </w:r>
+    </w:p>
+    <w:p>
+      <w:r>
+        <w:t xml:space="preserve">  `object-position: 20% 80%` + `scale(1.5)`, lalu **panel kuis muncul sendiri** saat video mencapai</w:t>
+      </w:r>
+    </w:p>
+    <w:p>
+      <w:r>
+        <w:t xml:space="preserve">  detiknya dengan video **paused** (mode jeda) sementara server tetap menolak menutup video (422).</w:t>
+      </w:r>
+    </w:p>
+    <w:p>
+      <w:r>
+        <w:t xml:space="preserve">  Batasan di A.31.5: harness baru mencakup satu jalur (mode _berjalan_ dan tata horizontal baru diuji</w:t>
+      </w:r>
+    </w:p>
+    <w:p>
+      <w:r>
+        <w:t xml:space="preserve">  Pest/Vitest), pemutaran masih satu MP4 dev (5,4 MB), dan langkah penyegaran log mentah di</w:t>
+      </w:r>
+    </w:p>
+    <w:p>
+      <w:r>
+        <w:t xml:space="preserve">  `export-word.sh` sengaja belum dijalankan.</w:t>
+      </w:r>
+    </w:p>
+    <w:p>
+      <w:r/>
+    </w:p>
+    <w:p>
+      <w:pPr>
+        <w:pStyle w:val="ListBullet"/>
+      </w:pPr>
+      <w:r>
+        <w:t>**Putaran papan 8 — penunjuk langkah koreksi manual (10 Oktober 2026)**: lanjutan utang A.27.6/A.31.5</w:t>
+      </w:r>
+    </w:p>
+    <w:p>
+      <w:r>
+        <w:t xml:space="preserve">  yang tidak mengubah makna token. Form koreksi setiap baris antrean kini memakai penunjuk langkah</w:t>
+      </w:r>
+    </w:p>
+    <w:p>
+      <w:r>
+        <w:t xml:space="preserve">  `1 Skor &amp; alasan → 2 Token konfirmasi → 3 Tersimpan` (komponen `Langkah`, `aria-current="step"`), dan</w:t>
+      </w:r>
+    </w:p>
+    <w:p>
+      <w:r>
+        <w:t xml:space="preserve">  nomor langkahnya dihitung pembantu murni `langkahKoreksi()` di `sections/scoring/tampilan.js` supaya</w:t>
+      </w:r>
+    </w:p>
+    <w:p>
+      <w:r>
+        <w:t xml:space="preserve">  penunjuk tidak pernah berbeda pendapat dengan keadaan tombol. Dua sisa tombol Bootstrap di `FormKoreksi`</w:t>
+      </w:r>
+    </w:p>
+    <w:p>
+      <w:r>
+        <w:t xml:space="preserve">  (salah satunya menempel tanpa spasi: `type="button"className=…`) diganti `Tombol varian="tepi"`.</w:t>
+      </w:r>
+    </w:p>
+    <w:p>
+      <w:r>
+        <w:t xml:space="preserve">  Verifikasi: Vitest scoring **19 passed** (3 tes baru), ESLint 0 masalah, checkJs OK, dan alur koreksi</w:t>
+      </w:r>
+    </w:p>
+    <w:p>
+      <w:r>
+        <w:t xml:space="preserve">  lewat layar sungguhan diulang lewat runner baru `docs/jalankan-smoke-ui.sh slice06` — **27/27 lulus**;</w:t>
+      </w:r>
+    </w:p>
+    <w:p>
+      <w:r>
+        <w:t xml:space="preserve">  `./verify.sh` **SEMUA HIJAU exit 0**. Batasan di A.32.3: susunan dua kolom "antrean kiri + detail kanan"</w:t>
+      </w:r>
+    </w:p>
+    <w:p>
+      <w:r>
+        <w:t xml:space="preserve">  belum (butuh keputusan baris mana yang otomatis terpilih agar harness slice 06 tetap sahih), dan token</w:t>
+      </w:r>
+    </w:p>
+    <w:p>
+      <w:r>
+        <w:t xml:space="preserve">  masih terisi otomatis dari respons server, belum diketik seperti di papan desain.</w:t>
       </w:r>
     </w:p>
     <w:sectPr>

</xml_diff>